<commit_message>
PERMIS : gestion de fichiers par agent + correction convocation
- PermisDocument : ajout FK permis_id nullable (docs liés à un agent)
- Permis : relation OneToMany agentDocuments
- Controller : routes upload/delete dédiées par agent (redirect vers edit)
- form.html.twig : section Documents + flatpickr month-picker
- permi.docx : texte convocation retouché (photo ANTS, note d'honoraire)
- Migration Version20260610072355
</commit_message>
<xml_diff>
--- a/convocations/permi.docx
+++ b/convocations/permi.docx
@@ -961,16 +961,16 @@
           <w:sz w:val="18"/>
           <w:szCs w:val="18"/>
         </w:rPr>
-        <w:t xml:space="preserve">Convocation </w:t>
-      </w:r>
-      <w:r>
-        <w:rPr>
-          <w:rFonts w:ascii="Montserrat" w:hAnsi="Montserrat"/>
-          <w:b/>
-          <w:sz w:val="18"/>
-          <w:szCs w:val="18"/>
-        </w:rPr>
-        <w:t>visite médicale</w:t>
+        <w:t>V</w:t>
+      </w:r>
+      <w:r>
+        <w:rPr>
+          <w:rFonts w:ascii="Montserrat" w:hAnsi="Montserrat"/>
+          <w:b/>
+          <w:sz w:val="18"/>
+          <w:szCs w:val="18"/>
+        </w:rPr>
+        <w:t>isite médicale</w:t>
       </w:r>
     </w:p>
     <w:p>
@@ -1076,7 +1076,7 @@
       <w:r>
         <w:rPr>
           <w:rFonts w:ascii="Montserrat" w:hAnsi="Montserrat"/>
-          <w:b/>
+          <w:bCs/>
           <w:sz w:val="20"/>
           <w:szCs w:val="20"/>
         </w:rPr>
@@ -1085,7 +1085,7 @@
       <w:r>
         <w:rPr>
           <w:rFonts w:ascii="Montserrat" w:hAnsi="Montserrat"/>
-          <w:b/>
+          <w:bCs/>
           <w:sz w:val="20"/>
           <w:szCs w:val="20"/>
         </w:rPr>
@@ -1094,7 +1094,7 @@
       <w:r>
         <w:rPr>
           <w:rFonts w:ascii="Montserrat" w:hAnsi="Montserrat"/>
-          <w:b/>
+          <w:bCs/>
           <w:sz w:val="20"/>
           <w:szCs w:val="20"/>
         </w:rPr>
@@ -1103,7 +1103,7 @@
       <w:r>
         <w:rPr>
           <w:rFonts w:ascii="Montserrat" w:hAnsi="Montserrat"/>
-          <w:b/>
+          <w:bCs/>
           <w:noProof/>
           <w:sz w:val="20"/>
           <w:szCs w:val="20"/>
@@ -1113,20 +1113,11 @@
       <w:r>
         <w:rPr>
           <w:rFonts w:ascii="Montserrat" w:hAnsi="Montserrat"/>
-          <w:b/>
-          <w:sz w:val="20"/>
-          <w:szCs w:val="20"/>
-        </w:rPr>
-        <w:fldChar w:fldCharType="end"/>
-      </w:r>
-      <w:r>
-        <w:rPr>
-          <w:rFonts w:ascii="Montserrat" w:hAnsi="Montserrat"/>
           <w:bCs/>
           <w:sz w:val="20"/>
           <w:szCs w:val="20"/>
         </w:rPr>
-        <w:t>,</w:t>
+        <w:fldChar w:fldCharType="end"/>
       </w:r>
       <w:r>
         <w:rPr>
@@ -1135,16 +1126,34 @@
           <w:sz w:val="20"/>
           <w:szCs w:val="20"/>
         </w:rPr>
-        <w:t xml:space="preserve"> j</w:t>
-      </w:r>
-      <w:r>
-        <w:rPr>
-          <w:rFonts w:ascii="Montserrat" w:hAnsi="Montserrat" w:cs="Times New Roman"/>
-          <w:iCs/>
-          <w:sz w:val="18"/>
-          <w:szCs w:val="18"/>
-        </w:rPr>
-        <w:t xml:space="preserve">e vous saurais gré de bien vouloir vous présenter le </w:t>
+        <w:t>,</w:t>
+      </w:r>
+      <w:r>
+        <w:rPr>
+          <w:rFonts w:ascii="Montserrat" w:hAnsi="Montserrat"/>
+          <w:bCs/>
+          <w:sz w:val="20"/>
+          <w:szCs w:val="20"/>
+        </w:rPr>
+        <w:t xml:space="preserve"> </w:t>
+      </w:r>
+      <w:r>
+        <w:rPr>
+          <w:rFonts w:ascii="Montserrat" w:hAnsi="Montserrat"/>
+          <w:bCs/>
+          <w:sz w:val="20"/>
+          <w:szCs w:val="20"/>
+        </w:rPr>
+        <w:t xml:space="preserve">votre visite médicale est prévue le </w:t>
+      </w:r>
+      <w:r>
+        <w:rPr>
+          <w:rFonts w:ascii="Montserrat" w:hAnsi="Montserrat" w:cs="Times New Roman"/>
+          <w:iCs/>
+          <w:sz w:val="18"/>
+          <w:szCs w:val="18"/>
+        </w:rPr>
+        <w:t xml:space="preserve"> </w:t>
       </w:r>
       <w:r>
         <w:rPr>
@@ -1295,34 +1304,16 @@
           <w:sz w:val="18"/>
           <w:szCs w:val="18"/>
         </w:rPr>
-        <w:t>à l’adresse suivante </w:t>
-      </w:r>
-      <w:r>
-        <w:rPr>
-          <w:rFonts w:ascii="Montserrat" w:hAnsi="Montserrat" w:cs="Times New Roman"/>
-          <w:iCs/>
-          <w:sz w:val="18"/>
-          <w:szCs w:val="18"/>
-        </w:rPr>
-        <w:t>a</w:t>
-      </w:r>
-      <w:r>
-        <w:rPr>
-          <w:rFonts w:ascii="Montserrat" w:hAnsi="Montserrat" w:cs="Times New Roman"/>
-          <w:iCs/>
-          <w:sz w:val="18"/>
-          <w:szCs w:val="18"/>
-        </w:rPr>
-        <w:t xml:space="preserve">fin d’y bénéficier d’une visite </w:t>
-      </w:r>
-      <w:r>
-        <w:rPr>
-          <w:rFonts w:ascii="Montserrat" w:hAnsi="Montserrat" w:cs="Times New Roman"/>
-          <w:iCs/>
-          <w:sz w:val="18"/>
-          <w:szCs w:val="18"/>
-        </w:rPr>
-        <w:t xml:space="preserve">médicale </w:t>
+        <w:t>à l’adresse suivante</w:t>
+      </w:r>
+      <w:r>
+        <w:rPr>
+          <w:rFonts w:ascii="Montserrat" w:hAnsi="Montserrat" w:cs="Times New Roman"/>
+          <w:iCs/>
+          <w:sz w:val="18"/>
+          <w:szCs w:val="18"/>
+        </w:rPr>
+        <w:t xml:space="preserve"> </w:t>
       </w:r>
       <w:r>
         <w:rPr>
@@ -1333,17 +1324,6 @@
         </w:rPr>
         <w:t>:</w:t>
       </w:r>
-    </w:p>
-    <w:p>
-      <w:pPr>
-        <w:jc w:val="both"/>
-        <w:rPr>
-          <w:rFonts w:ascii="Montserrat" w:hAnsi="Montserrat" w:cs="Times New Roman"/>
-          <w:iCs/>
-          <w:sz w:val="18"/>
-          <w:szCs w:val="18"/>
-        </w:rPr>
-      </w:pPr>
     </w:p>
     <w:p>
       <w:pPr>
@@ -1433,17 +1413,6 @@
         </w:rPr>
         <w:t>62200 BOULOGNE SUR MER</w:t>
       </w:r>
-    </w:p>
-    <w:p>
-      <w:pPr>
-        <w:jc w:val="both"/>
-        <w:rPr>
-          <w:rFonts w:ascii="Montserrat" w:hAnsi="Montserrat" w:cs="Times New Roman"/>
-          <w:iCs/>
-          <w:sz w:val="18"/>
-          <w:szCs w:val="18"/>
-        </w:rPr>
-      </w:pPr>
     </w:p>
     <w:p>
       <w:pPr>
@@ -1591,7 +1560,15 @@
           <w:sz w:val="18"/>
           <w:szCs w:val="18"/>
         </w:rPr>
-        <w:t>Photo</w:t>
+        <w:t>1 p</w:t>
+      </w:r>
+      <w:r>
+        <w:rPr>
+          <w:rFonts w:ascii="Montserrat" w:hAnsi="Montserrat"/>
+          <w:sz w:val="18"/>
+          <w:szCs w:val="18"/>
+        </w:rPr>
+        <w:t>hoto</w:t>
       </w:r>
       <w:r>
         <w:rPr>
@@ -1600,6 +1577,14 @@
           <w:szCs w:val="18"/>
         </w:rPr>
         <w:t xml:space="preserve"> d'identité</w:t>
+      </w:r>
+      <w:r>
+        <w:rPr>
+          <w:rFonts w:ascii="Montserrat" w:hAnsi="Montserrat"/>
+          <w:sz w:val="18"/>
+          <w:szCs w:val="18"/>
+        </w:rPr>
+        <w:t xml:space="preserve"> ANTS</w:t>
       </w:r>
     </w:p>
     <w:p>
@@ -1622,6 +1607,28 @@
           <w:szCs w:val="18"/>
         </w:rPr>
         <w:t>Justificatif de domicile</w:t>
+      </w:r>
+    </w:p>
+    <w:p>
+      <w:pPr>
+        <w:pStyle w:val="Paragraphedeliste"/>
+        <w:numPr>
+          <w:ilvl w:val="0"/>
+          <w:numId w:val="1"/>
+        </w:numPr>
+        <w:rPr>
+          <w:rFonts w:ascii="Montserrat" w:hAnsi="Montserrat"/>
+          <w:sz w:val="18"/>
+          <w:szCs w:val="18"/>
+        </w:rPr>
+      </w:pPr>
+      <w:r>
+        <w:rPr>
+          <w:rFonts w:ascii="Montserrat" w:hAnsi="Montserrat"/>
+          <w:sz w:val="18"/>
+          <w:szCs w:val="18"/>
+        </w:rPr>
+        <w:t>Note d'honoraire en 2 exemplaires</w:t>
       </w:r>
     </w:p>
     <w:p>

</xml_diff>